<commit_message>
Regenerate the rulebook editions and the sell sheet from the corrected source
The three v18 rulebook editions and the sell sheet still carried the pre-sweep
text: the +5 industry debut, the removed end-of-game HQ neighbour award, a tie
broken by money alone, and the tile counts that ignored five- and six-seat
tables. Regenerated from rulebook.data.mjs and make_sellsheet.mjs, which are
themselves now in step with the engine.

Co-Authored-By: Claude Opus 5 <noreply@anthropic.com>
Claude-Session: https://claude.ai/code/session_01PrAjux8gaxheGCQfmmpAzy
</commit_message>
<xml_diff>
--- a/Entrepreneurs_Rulebook_v18.docx
+++ b/Entrepreneurs_Rulebook_v18.docx
@@ -1622,7 +1622,7 @@
           <w:sz w:val="21"/>
           <w:szCs w:val="21"/>
         </w:rPr>
-        <w:t xml:space="preserve">Megacorp tiles: sixteen exist in four tiers of four. Two are drawn from each tier that is in play - which is twice the number of players. Tiers 4 and 3 are always in; tier 2 joins at three players, tier 1 only at four.</w:t>
+        <w:t xml:space="preserve">Megacorp tiles: sixteen exist in four tiers of four. Two are drawn from each tier that is in play - three at five players, all four at six. Tiers 4 and 3 are always in; tier 2 joins at three players, tier 1 only at four.</w:t>
       </w:r>
     </w:p>
     <w:p>
@@ -1794,7 +1794,7 @@
           <w:sz w:val="21"/>
           <w:szCs w:val="21"/>
         </w:rPr>
-        <w:t xml:space="preserve">All twelve quarters run the same five phases. You only make decisions in the first two - the rest resolves around you.</w:t>
+        <w:t xml:space="preserve">All twelve quarters run the same five phases. Planning and Action are where you act; the later phases resolve around you and stop only when there is a choice to make - where to deliver, what to sell short, where the hub goes, whether to repay a loan.</w:t>
       </w:r>
     </w:p>
     <w:tbl>
@@ -3025,7 +3025,7 @@
           <w:sz w:val="21"/>
           <w:szCs w:val="21"/>
         </w:rPr>
-        <w:t xml:space="preserve">A horizontal company (Utilities, Manufacturing, Technology) grows sideways: upgrading needs an adjacent plot that you own and that is empty. A vertical company (Retail, Hospitality, Healthcare) stacks on the plot it already occupies. Each company may be upgraded once.</w:t>
+        <w:t xml:space="preserve">A horizontal company (Utilities, Manufacturing, Technology) grows sideways: upgrading needs an adjacent plot that is empty and owned - by you or by anyone else, in which case you pay them rent for it, exactly as when you build. A vertical company (Retail, Hospitality, Healthcare) stacks on the plot it already occupies. Each company may be upgraded once.</w:t>
       </w:r>
     </w:p>
     <w:p>
@@ -3094,7 +3094,7 @@
           <w:sz w:val="21"/>
           <w:szCs w:val="21"/>
         </w:rPr>
-        <w:t xml:space="preserve">REPOSITION - move to first in turn order, and place both of your workers together at the start of next quarter's planning.</w:t>
+        <w:t xml:space="preserve">REPOSITION - move to first in turn order, and place your workers together at the start of next quarter's planning (two of your three at a two-player table).</w:t>
       </w:r>
     </w:p>
     <w:p>
@@ -3159,7 +3159,7 @@
           <w:sz w:val="21"/>
           <w:szCs w:val="21"/>
         </w:rPr>
-        <w:t xml:space="preserve">A plot's value is its printed road price plus $1 for every occupied plot next to it, plus $1 if it touches a Logistic Hub. Road prices run from 1 at the outer edge to 6 in the dead centre of the city. You pay that to buy, and you receive it when you sell - so land near the action genuinely appreciates as the city fills in.</w:t>
+        <w:t xml:space="preserve">A plot's value is its printed road price plus $1 for every occupied plot touching it - corners included, inside a district - plus $1 if it touches a Logistic Hub. Road prices run from 1 at the outer edge to 6 in the dead centre of the city. You pay that to buy, and you receive it when you sell - so land near the action genuinely appreciates as the city fills in.</w:t>
       </w:r>
     </w:p>
     <w:p>
@@ -3235,7 +3235,7 @@
           <w:sz w:val="21"/>
           <w:szCs w:val="21"/>
         </w:rPr>
-        <w:t xml:space="preserve">A company can only produce while every plot it stands on is owned by SOMEBODY - not necessarily by you. Selling one of those plots does not destroy the building, but it stops producing until somebody buys that ground, and whoever does collects its rent from then on.</w:t>
+        <w:t xml:space="preserve">A company can only produce while every plot it stands on is owned by SOMEBODY - not necessarily by you. Selling one of those plots does not destroy the building, but it stops producing until somebody buys that ground, and whoever does collects its rent from then on. Its bills are still charged while it stands idle.</w:t>
       </w:r>
     </w:p>
     <w:p>
@@ -4829,7 +4829,7 @@
           <w:sz w:val="21"/>
           <w:szCs w:val="21"/>
         </w:rPr>
-        <w:t xml:space="preserve">Every company pays OPEX to companies in other industries - its suppliers, printed on its Blueprint. The chain closes a loop, so no industry is ever a dead end. Level 1 cards have one supplier, level 2 have two, and level 3 have all three.</w:t>
+        <w:t xml:space="preserve">Every company pays a supplier bill - its printed OPEX less $2 a level of ground rent - to companies in other industries: its suppliers, printed on its Blueprint. The chain closes a loop, so no industry is ever a dead end. Level 1 cards have one supplier, level 2 have two, and level 3 have all three.</w:t>
       </w:r>
     </w:p>
     <w:tbl>
@@ -5761,7 +5761,7 @@
           <w:sz w:val="21"/>
           <w:szCs w:val="21"/>
         </w:rPr>
-        <w:t xml:space="preserve">If the bill still cannot be met once a company's OPEX comes due, that company enters SOLVENCY: the bank sells for you, at those same half rates, and the company that triggered it goes to the bank as a Distressed Asset.</w:t>
+        <w:t xml:space="preserve">If you close the window with the bill still short, the bank sells for you at those same half rates - Blueprints first, then your cheapest plots, then your weakest companies - and if that is still not enough when a company's bill comes due, that company enters SOLVENCY: whatever else you have goes at half, and the company that triggered it goes to the bank as a Distressed Asset.</w:t>
       </w:r>
     </w:p>
     <w:p>
@@ -5930,7 +5930,7 @@
           <w:sz w:val="21"/>
           <w:szCs w:val="21"/>
         </w:rPr>
-        <w:t xml:space="preserve">Each icon can be sold to once, by whoever gets there first - and it is filled whole, however many units it took.</w:t>
+        <w:t xml:space="preserve">Each icon can be sold to once, by whoever gets there first - and it is filled whole, however many units it took, though you are only paid for units you actually had.</w:t>
       </w:r>
     </w:p>
     <w:p>
@@ -6465,7 +6465,7 @@
                 <w:sz w:val="19"/>
                 <w:szCs w:val="19"/>
               </w:rPr>
-              <w:t xml:space="preserve">Delivers two units to every icon it reaches instead of one.</w:t>
+              <w:t xml:space="preserve">Every icon it fills takes twice its column in units - 2, 4, 6 or 8 - and pays for all of them.</w:t>
             </w:r>
           </w:p>
         </w:tc>
@@ -6566,7 +6566,7 @@
           <w:sz w:val="21"/>
           <w:szCs w:val="21"/>
         </w:rPr>
-        <w:t xml:space="preserve">Every quarter ends with a new Logistic Hub being built on an empty plot. The first player in turn order chooses which one. That plot is filled for good - nothing can be built there afterwards - and the hub adds its own district to the network.</w:t>
+        <w:t xml:space="preserve">Every quarter ends with a new Logistic Hub being built on an empty plot that nobody owns. The first player in turn order chooses which one. That plot is filled for good - nothing can be built there afterwards - and the hub adds its own district to the network.</w:t>
       </w:r>
     </w:p>
     <w:p>
@@ -6602,7 +6602,7 @@
           <w:sz w:val="21"/>
           <w:szCs w:val="21"/>
         </w:rPr>
-        <w:t xml:space="preserve">The Real-Estate Mogul and The Omnipresent are awarded - 5 EP each, to the outright leader only.</w:t>
+        <w:t xml:space="preserve">The Real-Estate Mogul and The Omnipresent are awarded - 5 EP each to the outright leader at 2-3 players, 10 EP each at 4 or more. They are also paid at the final quarter if the game is called before Q12.</w:t>
       </w:r>
     </w:p>
     <w:p>
@@ -6694,7 +6694,7 @@
           <w:sz w:val="21"/>
           <w:szCs w:val="21"/>
         </w:rPr>
-        <w:t xml:space="preserve">There is nothing held back and nothing to keep track of on the cards: every EP you have earned is banked, and the standings are the score. You never lose EP you have already scored - not when a company is sold, not when it goes distressed, not when it is merged into a Megacorp.</w:t>
+        <w:t xml:space="preserve">There is nothing held back and nothing to keep track of on the cards: every EP you have earned is banked, and the standings are the score. You never lose EP you have already scored - not when a company is sold, not when it goes distressed, not when it is merged into a Megacorp. A distressed shell that is bought back scores its levels again for its new owner, so a company can score twice in its life.</w:t>
       </w:r>
     </w:p>
     <w:p>
@@ -6728,7 +6728,7 @@
           <w:sz w:val="21"/>
           <w:szCs w:val="21"/>
         </w:rPr>
-        <w:t xml:space="preserve">Going public always means merging companies to claim a Megacorp tile, from the very first time it is done. Each tile names an exact combination of company levels and pays between 8 and 22 EP, and you must hold precisely that combination of active companies.</w:t>
+        <w:t xml:space="preserve">Going public always means merging companies to claim a Megacorp tile, from the very first time it is done. Each tile names a combination of company levels and pays between 8 and 22 EP; you must hold at least those companies, and any beyond the combination stay yours. If your companies match more than one tile, the best-paying one is claimed; what you choose is which of the merged companies becomes the headquarters.</w:t>
       </w:r>
     </w:p>
     <w:p>
@@ -6873,7 +6873,7 @@
           <w:sz w:val="21"/>
           <w:szCs w:val="21"/>
         </w:rPr>
-        <w:t xml:space="preserve">A headquarters is public infrastructure: it counts as a Logistic Hub. Any company built orthogonally beside one joins the network through it, whoever owns them. A monument that only collected would be a monument nobody wanted to build near - and the companies that gather round it are exactly the ones it scores 3 EP each for at the end.</w:t>
+        <w:t xml:space="preserve">A headquarters is public infrastructure: it counts as a Logistic Hub. Any company built orthogonally beside one joins the network through it, whoever owns them. A monument that only collected would be a monument nobody wanted to build near - and the companies that gather round it are exactly the ones it pays a tithe to.</w:t>
       </w:r>
     </w:p>
     <w:p>
@@ -6930,7 +6930,7 @@
           <w:sz w:val="21"/>
           <w:szCs w:val="21"/>
         </w:rPr>
-        <w:t xml:space="preserve">At the end of the game the HQ scores 3 EP for every OTHER company standing orthogonally beside it - the district that grew up around it. Counted at scoring, not when the Megacorp forms, so where you put your headquarters is a bet on where the city fills in.</w:t>
+        <w:t xml:space="preserve">Every quarter it stands, the HQ pays 1 EP to every RIVAL company standing orthogonally beside it, and that company's owner banks it. Your OWN companies beside your own HQ cost you nothing - they are paid and you are charged in the same breath, which cancels. So a headquarters wedged into somebody else's district bleeds all game, and where you put it is a bet on who builds next to you.</w:t>
       </w:r>
     </w:p>
     <w:p>
@@ -6944,7 +6944,7 @@
           <w:sz w:val="21"/>
           <w:szCs w:val="21"/>
         </w:rPr>
-        <w:t xml:space="preserve">Twice the number of players are in play - eight at a four-player table - so a combination you are working toward is usually still there, but the best-paying ones are contested.</w:t>
+        <w:t xml:space="preserve">Eight tiles are in play at a four-player table, twelve at five and all sixteen at six, so a combination you are working toward is usually still there, but the best-paying ones are contested.</w:t>
       </w:r>
     </w:p>
     <w:p>
@@ -9804,7 +9804,7 @@
                 <w:sz w:val="19"/>
                 <w:szCs w:val="19"/>
               </w:rPr>
-              <w:t xml:space="preserve">+5 each, once per industry per game, banked immediately</w:t>
+              <w:t xml:space="preserve">+3 each, once per industry per game, banked immediately</w:t>
             </w:r>
           </w:p>
         </w:tc>
@@ -10001,7 +10001,7 @@
                 <w:sz w:val="19"/>
                 <w:szCs w:val="19"/>
               </w:rPr>
-              <w:t xml:space="preserve">Megacorp HQ, at the end</w:t>
+              <w:t xml:space="preserve">Megacorp HQ, every quarter</w:t>
             </w:r>
           </w:p>
         </w:tc>
@@ -10028,7 +10028,7 @@
                 <w:sz w:val="19"/>
                 <w:szCs w:val="19"/>
               </w:rPr>
-              <w:t xml:space="preserve">+3 for each other company beside it</w:t>
+              <w:t xml:space="preserve">+its industry's price divided by the tile's tier; and it pays 1 EP to each rival company beside it, which that owner banks</w:t>
             </w:r>
           </w:p>
         </w:tc>
@@ -10084,7 +10084,7 @@
                 <w:sz w:val="19"/>
                 <w:szCs w:val="19"/>
               </w:rPr>
-              <w:t xml:space="preserve">+5 to the leader alone</w:t>
+              <w:t xml:space="preserve">+5 to the leader alone, +10 at 4+ players</w:t>
             </w:r>
           </w:p>
         </w:tc>
@@ -10140,7 +10140,7 @@
                 <w:sz w:val="19"/>
                 <w:szCs w:val="19"/>
               </w:rPr>
-              <w:t xml:space="preserve">+5 to the leader alone</w:t>
+              <w:t xml:space="preserve">+5 to the leader alone, +10 at 4+ players</w:t>
             </w:r>
           </w:p>
         </w:tc>
@@ -10302,7 +10302,7 @@
           <w:sz w:val="21"/>
           <w:szCs w:val="21"/>
         </w:rPr>
-        <w:t xml:space="preserve">Only the outright leader scores a land award, and a shared lead pays badly: 5 EP alone, 2 EP each if two players tie, 1 EP each if three or more do. Second place gets nothing.</w:t>
+        <w:t xml:space="preserve">Only the outright leader scores a land award, and a shared lead pays badly. At two and three players: 5 EP alone, 2 EP each if two tie, 1 EP each if three or more do. At four players and up every figure doubles - 10 EP alone, 4 each for a two-way tie, 2 each beyond that. Second place gets nothing at any count.</w:t>
       </w:r>
     </w:p>
     <w:p>
@@ -10381,7 +10381,7 @@
           <w:sz w:val="21"/>
           <w:szCs w:val="21"/>
         </w:rPr>
-        <w:t xml:space="preserve">Personas are asymmetric powers, one tied to each industry. They are dealt by default - leave them out for a first game if you like - and only as many as there are players are dealt, so at least two always sit out. Everyone's persona is public from the start, so you can weigh your own specialism and everybody else's while drafting.</w:t>
+        <w:t xml:space="preserve">Personas are asymmetric powers, one tied to each industry. They are dealt by default - leave them out for a first game if you like - and only as many as there are players are dealt, so at a small table some sit out. Everyone's persona is public from the start, so you can weigh your own specialism and everybody else's while drafting.</w:t>
       </w:r>
     </w:p>
     <w:tbl>
@@ -10512,7 +10512,7 @@
                 <w:sz w:val="19"/>
                 <w:szCs w:val="19"/>
               </w:rPr>
-              <w:t xml:space="preserve">Your Technology companies upgrade vertically, stacking on one plot instead of needing a free neighbour.</w:t>
+              <w:t xml:space="preserve">Your Technology companies may upgrade vertically, stacking on one plot instead of needing a free neighbour - or spread as Technology usually does. You choose at each upgrade.</w:t>
             </w:r>
           </w:p>
         </w:tc>
@@ -10568,7 +10568,7 @@
                 <w:sz w:val="19"/>
                 <w:szCs w:val="19"/>
               </w:rPr>
-              <w:t xml:space="preserve">Your Healthcare companies ignore the level restriction: a level-1 clinic may serve any column of a Healthcare row.</w:t>
+              <w:t xml:space="preserve">Your Healthcare companies may serve any column of a Healthcare row whatever their level - but a unit sold above your company's level pays $1 less than the price.</w:t>
             </w:r>
           </w:p>
         </w:tc>
@@ -10624,7 +10624,7 @@
                 <w:sz w:val="19"/>
                 <w:szCs w:val="19"/>
               </w:rPr>
-              <w:t xml:space="preserve">When your Manufacturing cross-sells into another industry's row, it is paid that industry's price rather than its own.</w:t>
+              <w:t xml:space="preserve">When your Manufacturing cross-sells into another industry's row, it may be paid that industry's price instead of its own - whichever is higher.</w:t>
             </w:r>
           </w:p>
         </w:tc>
@@ -10680,7 +10680,7 @@
                 <w:sz w:val="19"/>
                 <w:szCs w:val="19"/>
               </w:rPr>
-              <w:t xml:space="preserve">Your Hospitality companies upgrade horizontally, spreading across plots so more businesses and hubs sit adjacent to them.</w:t>
+              <w:t xml:space="preserve">Your Hospitality companies may upgrade horizontally, spreading across plots so more businesses and hubs sit adjacent to them - or stack as Hospitality usually does. You choose at each upgrade.</w:t>
             </w:r>
           </w:p>
         </w:tc>
@@ -10736,7 +10736,7 @@
                 <w:sz w:val="19"/>
                 <w:szCs w:val="19"/>
               </w:rPr>
-              <w:t xml:space="preserve">At the start of Revenue, raise one industry you do NOT operate by one step; your Retail then reaches one extra district this quarter.</w:t>
+              <w:t xml:space="preserve">At the start of Production, you may raise one industry you do NOT operate by one step; your Retail then reaches one extra district this quarter. You may also decline.</w:t>
             </w:r>
           </w:p>
         </w:tc>
@@ -10792,7 +10792,7 @@
                 <w:sz w:val="19"/>
                 <w:szCs w:val="19"/>
               </w:rPr>
-              <w:t xml:space="preserve">Your Utilities production sells for $1 above the current price.</w:t>
+              <w:t xml:space="preserve">At the start of Production you may switch your concession on: your Utilities production then sells for $1 above the current price this quarter. Every quarter you sell at that premium, the Utilities price falls one step at the end of the quarter.</w:t>
             </w:r>
           </w:p>
         </w:tc>
@@ -12298,7 +12298,7 @@
                 <w:sz w:val="19"/>
                 <w:szCs w:val="19"/>
               </w:rPr>
-              <w:t xml:space="preserve">most money, then fewest loan discs in the bank</w:t>
+              <w:t xml:space="preserve">most active companies, then most money, then fewest loan discs in the bank</w:t>
             </w:r>
           </w:p>
         </w:tc>
@@ -12578,7 +12578,7 @@
                 <w:sz w:val="19"/>
                 <w:szCs w:val="19"/>
               </w:rPr>
-              <w:t xml:space="preserve">5 EP to the outright leader in plots, and in districts, at every year end</w:t>
+              <w:t xml:space="preserve">5 EP to the outright leader in plots, and in districts, at every year end - 10 at 4+ players</w:t>
             </w:r>
           </w:p>
         </w:tc>
@@ -12634,7 +12634,7 @@
                 <w:sz w:val="19"/>
                 <w:szCs w:val="19"/>
               </w:rPr>
-              <w:t xml:space="preserve">one per quarter, on an empty plot; reaches its own district; joins orthogonally</w:t>
+              <w:t xml:space="preserve">one per quarter, on an empty unowned plot; reaches its own district; joins orthogonally</w:t>
             </w:r>
           </w:p>
         </w:tc>
@@ -12992,7 +12992,7 @@
                 <w:sz w:val="19"/>
                 <w:szCs w:val="19"/>
               </w:rPr>
-              <w:t xml:space="preserve">Where the owners, not the managers, decide - restructures, flotations, who chairs the table. In the game: go public to form a Megacorp, or reposition yourself to first in turn order. Costs both your workers.</w:t>
+              <w:t xml:space="preserve">Where the owners, not the managers, decide - restructures, flotations, who chairs the table. In the game: go public to form a Megacorp, or reposition yourself to first in turn order. Your workers go here together.</w:t>
             </w:r>
           </w:p>
         </w:tc>
@@ -13148,7 +13148,7 @@
                 <w:sz w:val="19"/>
                 <w:szCs w:val="19"/>
               </w:rPr>
-              <w:t xml:space="preserve">Operating expenditure - the recurring cost of running what you already own. Wages, power, stock: the things that bill you again next month whether or not you sold anything. In the game: your supplier bill, charged every quarter per company, paid to the industries your Blueprint lists as suppliers.</w:t>
+              <w:t xml:space="preserve">Operating expenditure - the recurring cost of running what you already own. Wages, power, stock: the things that bill you again next month whether or not you sold anything. In the game: the running cost printed on each Blueprint, charged every quarter - $2 a level of it is ground rent to the landlord, the rest is the supplier bill paid to the industries the card lists.</w:t>
             </w:r>
           </w:p>
         </w:tc>
@@ -14356,7 +14356,7 @@
                 <w:sz w:val="19"/>
                 <w:szCs w:val="19"/>
               </w:rPr>
-              <w:t xml:space="preserve">Growing by taking more ground at the same stage - outward, across sites. In the game: how Utilities, Manufacturing and Technology upgrade, each new level needing an empty plot of yours beside the building.</w:t>
+              <w:t xml:space="preserve">Growing by taking more ground at the same stage - outward, across sites. In the game: how Utilities, Manufacturing and Technology upgrade, each new level needing an empty owned plot beside the building.</w:t>
             </w:r>
           </w:p>
         </w:tc>
@@ -14412,7 +14412,7 @@
                 <w:sz w:val="19"/>
                 <w:szCs w:val="19"/>
               </w:rPr>
-              <w:t xml:space="preserve">A distribution centre - it moves goods rather than making them. In the game: opens on an empty plot each quarter and extends what the companies beside it can reach.</w:t>
+              <w:t xml:space="preserve">A distribution centre - it moves goods rather than making them. In the game: opens on an empty unowned plot each quarter and extends what the companies beside it can reach.</w:t>
             </w:r>
           </w:p>
         </w:tc>

</xml_diff>